<commit_message>
fix(legal): correcciones del revisor + README-ICABARU + build reproducible (refs #8 #9)
</commit_message>
<xml_diff>
--- a/clientes/icabaru/entregables/03_DESCRIPCION_DE_CARGOS/03a_Descripcion_Funciones_Ayudante_de_Cocina.docx
+++ b/clientes/icabaru/entregables/03_DESCRIPCION_DE_CARGOS/03a_Descripcion_Funciones_Ayudante_de_Cocina.docx
@@ -140,6 +140,18 @@
         </w:tc>
       </w:tr>
     </w:tbl>
+    <w:p>
+      <w:pPr>
+        <w:spacing w:after="120"/>
+      </w:pPr>
+      <w:r>
+        <w:rPr>
+          <w:sz w:val="20"/>
+          <w:szCs w:val="20"/>
+        </w:rPr>
+        <w:t xml:space="preserve">Contenido obligatorio del contrato escrito: incluye la denominación del puesto de trabajo o cargo con una descripción de los servicios a prestar (num. 3).</w:t>
+      </w:r>
+    </w:p>
     <w:p>
       <w:pPr>
         <w:pStyle w:val="Heading1"/>

</xml_diff>